<commit_message>
Corrijo TP5 punto 2
</commit_message>
<xml_diff>
--- a/Practica 5/Práctica 5 - Análisis de Datos y Visualización.docx
+++ b/Practica 5/Práctica 5 - Análisis de Datos y Visualización.docx
@@ -884,6 +884,7 @@
       <w:pPr>
         <w:rPr>
           <w:szCs w:val="32"/>
+          <w:lang w:val="es-ES"/>
         </w:rPr>
       </w:pPr>
       <w:r>
@@ -898,19 +899,20 @@
         <w:rPr>
           <w:szCs w:val="32"/>
         </w:rPr>
-        <w:t xml:space="preserve"> Utilizaría una tabla </w:t>
-      </w:r>
-      <w:r>
-        <w:rPr>
-          <w:szCs w:val="32"/>
-        </w:rPr>
-        <w:t>ya que es la mejor para mostrar números totales, ya que, estas se centran por lo general en valores individuales.</w:t>
-      </w:r>
-      <w:r>
-        <w:rPr>
-          <w:szCs w:val="32"/>
-        </w:rPr>
-        <w:t xml:space="preserve"> // histograma</w:t>
+        <w:t xml:space="preserve"> Utilizaría un</w:t>
+      </w:r>
+      <w:r>
+        <w:rPr>
+          <w:szCs w:val="32"/>
+        </w:rPr>
+        <w:t xml:space="preserve"> gr</w:t>
+      </w:r>
+      <w:r>
+        <w:rPr>
+          <w:szCs w:val="32"/>
+          <w:lang w:val="es-ES"/>
+        </w:rPr>
+        <w:t>áfico de barras el cual en el eje X estén distribuidas las edades y en el eje Y la cantidad total de las mismas.</w:t>
       </w:r>
     </w:p>
     <w:p>
@@ -1111,13 +1113,13 @@
         <w:rPr>
           <w:szCs w:val="32"/>
         </w:rPr>
-        <w:t>: Podríamos usar un gráfico de barra el cual en el eje Y tendríamos el presupuesto total, y en el eje X tendríamos el departamento, dentro de cada barra subcategorías de cada actividad específica con el presupuesto designado.</w:t>
-      </w:r>
-      <w:r>
-        <w:rPr>
-          <w:szCs w:val="32"/>
-        </w:rPr>
-        <w:t xml:space="preserve">  // cambiar a treemap</w:t>
+        <w:t xml:space="preserve">: Podríamos usar un </w:t>
+      </w:r>
+      <w:r>
+        <w:rPr>
+          <w:szCs w:val="32"/>
+        </w:rPr>
+        <w:t>treemap ya que maneja jerarquías, además de ser muy útil para mostrar valores totales por categorías.</w:t>
       </w:r>
     </w:p>
     <w:p>
@@ -1228,21 +1230,7 @@
         <w:rPr>
           <w:szCs w:val="32"/>
         </w:rPr>
-        <w:t xml:space="preserve">Se tiene un conjunto de datos con comentarios sobre el trailer de la película realizados por los seguidores de perfil fan de la misma. ¿Qué tipo de gráfico usaría para evaluar qué comentarios son más frecuentes </w:t>
-      </w:r>
-      <w:proofErr w:type="gramStart"/>
-      <w:r>
-        <w:rPr>
-          <w:szCs w:val="32"/>
-        </w:rPr>
-        <w:t>y</w:t>
-      </w:r>
-      <w:proofErr w:type="gramEnd"/>
-      <w:r>
-        <w:rPr>
-          <w:szCs w:val="32"/>
-        </w:rPr>
-        <w:t xml:space="preserve"> por lo tanto, describen al trailer de la película?</w:t>
+        <w:t>Se tiene un conjunto de datos con comentarios sobre el trailer de la película realizados por los seguidores de perfil fan de la misma. ¿Qué tipo de gráfico usaría para evaluar qué comentarios son más frecuentes y por lo tanto, describen al trailer de la película?</w:t>
       </w:r>
     </w:p>
     <w:p>
@@ -1394,13 +1382,13 @@
         <w:rPr>
           <w:szCs w:val="32"/>
         </w:rPr>
-        <w:t xml:space="preserve"> Utilizaría un mapa de área de Argentina. Podríamos identificar utilizando un color y sus variaciones de tono la densidad de la población.</w:t>
-      </w:r>
-      <w:r>
-        <w:rPr>
-          <w:szCs w:val="32"/>
-        </w:rPr>
-        <w:t xml:space="preserve"> // especificar mapa de calor</w:t>
+        <w:t xml:space="preserve"> Utilizaría un mapa de área de Argentina. Podríamos identificar utilizando un color y sus variaciones de tono la densidad de la población</w:t>
+      </w:r>
+      <w:r>
+        <w:rPr>
+          <w:szCs w:val="32"/>
+        </w:rPr>
+        <w:t>, es decir, un tono mas oscuro para representar las zonas más densamente pobladas y un tono más claro para representar las zonas menos densamente pobladas.</w:t>
       </w:r>
     </w:p>
     <w:p>

</xml_diff>